<commit_message>
Revise documented project timing
</commit_message>
<xml_diff>
--- a/02-dashboard/docs/PipelineOS_End-to-End_Documentation.docx
+++ b/02-dashboard/docs/PipelineOS_End-to-End_Documentation.docx
@@ -17302,7 +17302,7 @@
           <w:color w:val="20211D"/>
           <w:sz w:val="22"/>
         </w:rPr>
-        <w:t>The initial assessment-ready build took approximately 3.5 hours. Review-driven polish and production hardening took approximately 2 hours, for roughly 5.5 hours total.</w:t>
+        <w:t>The initial end-to-end build took approximately 2.5 hours. Review-driven UI refinement and production hardening took approximately 1.5 hours, followed by 30 minutes of final documentation and security verification, for roughly 4.5 hours total.</w:t>
       </w:r>
     </w:p>
     <w:tbl>
@@ -17430,7 +17430,7 @@
                 <w:color w:val="20211D"/>
                 <w:sz w:val="18"/>
               </w:rPr>
-              <w:t>35 minutes</w:t>
+              <w:t>20 minutes</w:t>
             </w:r>
           </w:p>
         </w:tc>
@@ -17486,7 +17486,7 @@
                 <w:color w:val="20211D"/>
                 <w:sz w:val="18"/>
               </w:rPr>
-              <w:t>60 minutes</w:t>
+              <w:t>45 minutes</w:t>
             </w:r>
           </w:p>
         </w:tc>
@@ -17542,7 +17542,7 @@
                 <w:color w:val="20211D"/>
                 <w:sz w:val="18"/>
               </w:rPr>
-              <w:t>65 minutes</w:t>
+              <w:t>45 minutes</w:t>
             </w:r>
           </w:p>
         </w:tc>
@@ -17598,7 +17598,7 @@
                 <w:color w:val="20211D"/>
                 <w:sz w:val="18"/>
               </w:rPr>
-              <w:t>60 minutes</w:t>
+              <w:t>40 minutes</w:t>
             </w:r>
           </w:p>
         </w:tc>
@@ -17654,7 +17654,7 @@
                 <w:color w:val="20211D"/>
                 <w:sz w:val="18"/>
               </w:rPr>
-              <w:t>35 minutes</w:t>
+              <w:t>30 minutes</w:t>
             </w:r>
           </w:p>
         </w:tc>
@@ -17710,7 +17710,7 @@
                 <w:color w:val="20211D"/>
                 <w:sz w:val="18"/>
               </w:rPr>
-              <w:t>75 minutes</w:t>
+              <w:t>90 minutes</w:t>
             </w:r>
           </w:p>
         </w:tc>

</xml_diff>